<commit_message>
Update references to Donnie Rey Saturno and Marvin Ralph Bautista
</commit_message>
<xml_diff>
--- a/Resume - Charles Michael Cayno (ATS v2).docx
+++ b/Resume - Charles Michael Cayno (ATS v2).docx
@@ -861,10 +861,32 @@
     </w:p>
     <w:p>
       <w:pPr>
-        <w:spacing w:before="0" w:after="80"/>
+        <w:pStyle w:val="ListBullet"/>
+        <w:spacing w:before="0" w:after="50"/>
       </w:pPr>
       <w:r>
-        <w:t>Available upon request.</w:t>
+        <w:rPr>
+          <w:b/>
+        </w:rPr>
+        <w:t xml:space="preserve">Donnie Rey Saturno </w:t>
+      </w:r>
+      <w:r>
+        <w:t>— Senior Applications Engineering Manager (DonnieRey.Saturno@power.com)</w:t>
+      </w:r>
+    </w:p>
+    <w:p>
+      <w:pPr>
+        <w:pStyle w:val="ListBullet"/>
+        <w:spacing w:before="0" w:after="50"/>
+      </w:pPr>
+      <w:r>
+        <w:rPr>
+          <w:b/>
+        </w:rPr>
+        <w:t xml:space="preserve">Marvin Ralph Bautista </w:t>
+      </w:r>
+      <w:r>
+        <w:t>— Staff Engineer, New Product Definition (ralph.bautista@power.com)</w:t>
       </w:r>
     </w:p>
     <w:sectPr>

</xml_diff>

<commit_message>
Remove APEC 2027 Industry Session Proposal entry from Version 2 resume files
</commit_message>
<xml_diff>
--- a/Resume - Charles Michael Cayno (ATS v2).docx
+++ b/Resume - Charles Michael Cayno (ATS v2).docx
@@ -52,7 +52,7 @@
         <w:spacing w:before="0" w:after="80"/>
       </w:pPr>
       <w:r>
-        <w:t>Results-driven Senior Power Supply Design Engineer with over 6 years of professional experience in the design, development, simulation, and validation of high-efficiency AC-DC and DC-DC power supply systems. Recognized expert in switch-mode power supply (SMPS) topologies, custom magnetic component design, high dv/dt &amp; thermal stress analysis, and EMI/EMC mitigation. Proven capability in digital power control, test automation with Python, global project execution (including US engineering assignment), conference paper authoring (APEC, PCIM), and product qualification under global regulatory standards (IEC, UL, FCC, CCC). Skilled in leading engineering projects, cross-functional collaboration, and mentoring technical teams.</w:t>
+        <w:t>Results-driven Senior Power Supply Design Engineer with over 6 years of professional experience in the design, development, simulation, and validation of high-efficiency AC-DC and DC-DC power supply systems. Recognized expert in switch-mode power supply (SMPS) topologies, custom magnetic component design, high dv/dt &amp; thermal stress analysis, and EMI/EMC mitigation. Proven capability in digital power control, test automation with Python, global project execution (including US engineering assignment), conference paper authoring (PCIM), and product qualification under global regulatory standards (IEC, UL, FCC, CCC). Skilled in leading engineering projects, cross-functional collaboration, and mentoring technical teams.</w:t>
       </w:r>
     </w:p>
     <w:p>
@@ -253,7 +253,7 @@
         <w:spacing w:before="0" w:after="50"/>
       </w:pPr>
       <w:r>
-        <w:t>Author conference proposals (APEC 2027) and technical papers, collaborate with cross-functional engineering teams, and mentor junior engineers in power electronics design and testing.</w:t>
+        <w:t>Author technical papers, collaborate with cross-functional engineering teams, and mentor junior engineers in power electronics design and testing.</w:t>
       </w:r>
     </w:p>
     <w:p>
@@ -299,21 +299,6 @@
       </w:r>
       <w:r>
         <w:t>Stationed in the US (May – June 2026) collaborating with lead engineers (Thomas &amp; Jared) on the SilentBridge high-power platform. Conducted extreme high-temperature stress testing (125°C Tj, 95°C ambient) and root-cause failure analysis (RCA) on shorted LV/HV FETs.</w:t>
-      </w:r>
-    </w:p>
-    <w:p>
-      <w:pPr>
-        <w:pStyle w:val="ListBullet"/>
-        <w:spacing w:before="0" w:after="50"/>
-      </w:pPr>
-      <w:r>
-        <w:rPr>
-          <w:b/>
-        </w:rPr>
-        <w:t xml:space="preserve">APEC 2027 Industry Session Proposal: </w:t>
-      </w:r>
-      <w:r>
-        <w:t>Authored and submitted an accepted Industry Session proposal for APEC 2027 titled 'Multi-output Regulation in Stadium Lighting'.</w:t>
       </w:r>
     </w:p>
     <w:p>

</xml_diff>